<commit_message>
Diagramas en PowerDesigner: modelos, imagenes y documentos actualizados
</commit_message>
<xml_diff>
--- a/01. UML/01. ERS/ERS_EUREKA_RESTFUL_JAVA_CONBDD_GR01.docx
+++ b/01. UML/01. ERS/ERS_EUREKA_RESTFUL_JAVA_CONBDD_GR01.docx
@@ -4436,7 +4436,7 @@
       <w:r>
         <w:drawing>
           <wp:inline distT="0" distB="0" distL="0" distR="0">
-            <wp:extent cx="5715000" cy="1323975"/>
+            <wp:extent cx="5715000" cy="2895804"/>
             <wp:effectExtent t="0" r="0" b="0" l="0"/>
             <wp:docPr id="1" name="" descr="" title=""/>
             <wp:cNvGraphicFramePr>
@@ -4452,7 +4452,7 @@
                     </pic:cNvPicPr>
                   </pic:nvPicPr>
                   <pic:blipFill>
-                    <a:blip r:embed="rId10" cstate="none"/>
+                    <a:blip r:embed="rIdPD1" cstate="none"/>
                     <a:srcRect/>
                     <a:stretch>
                       <a:fillRect/>
@@ -4461,7 +4461,7 @@
                   <pic:spPr bwMode="auto">
                     <a:xfrm>
                       <a:off x="0" y="0"/>
-                      <a:ext cx="5715000" cy="1323975"/>
+                      <a:ext cx="5715000" cy="2895804"/>
                     </a:xfrm>
                     <a:prstGeom prst="rect">
                       <a:avLst/>
@@ -4690,7 +4690,7 @@
       <w:r>
         <w:drawing>
           <wp:inline distT="0" distB="0" distL="0" distR="0">
-            <wp:extent cx="5715000" cy="7343775"/>
+            <wp:extent cx="5715000" cy="5641245"/>
             <wp:effectExtent t="0" r="0" b="0" l="0"/>
             <wp:docPr id="2" name="" descr="" title=""/>
             <wp:cNvGraphicFramePr>
@@ -4706,7 +4706,7 @@
                     </pic:cNvPicPr>
                   </pic:nvPicPr>
                   <pic:blipFill>
-                    <a:blip r:embed="rId11" cstate="none"/>
+                    <a:blip r:embed="rIdPD2" cstate="none"/>
                     <a:srcRect/>
                     <a:stretch>
                       <a:fillRect/>
@@ -4715,7 +4715,7 @@
                   <pic:spPr bwMode="auto">
                     <a:xfrm>
                       <a:off x="0" y="0"/>
-                      <a:ext cx="5715000" cy="7343775"/>
+                      <a:ext cx="5715000" cy="5641245"/>
                     </a:xfrm>
                     <a:prstGeom prst="rect">
                       <a:avLst/>
@@ -25165,7 +25165,7 @@
       <w:r>
         <w:drawing>
           <wp:inline distT="0" distB="0" distL="0" distR="0">
-            <wp:extent cx="5905500" cy="1619250"/>
+            <wp:extent cx="5905500" cy="3478085"/>
             <wp:effectExtent t="0" r="0" b="0" l="0"/>
             <wp:docPr id="3" name="" descr="" title=""/>
             <wp:cNvGraphicFramePr>
@@ -25181,7 +25181,7 @@
                     </pic:cNvPicPr>
                   </pic:nvPicPr>
                   <pic:blipFill>
-                    <a:blip r:embed="rId12" cstate="none"/>
+                    <a:blip r:embed="rIdPD3" cstate="none"/>
                     <a:srcRect/>
                     <a:stretch>
                       <a:fillRect/>
@@ -25190,7 +25190,7 @@
                   <pic:spPr bwMode="auto">
                     <a:xfrm>
                       <a:off x="0" y="0"/>
-                      <a:ext cx="5905500" cy="1619250"/>
+                      <a:ext cx="5905500" cy="3478085"/>
                     </a:xfrm>
                     <a:prstGeom prst="rect">
                       <a:avLst/>

</xml_diff>